<commit_message>
feat: completa y valida entregables del proyecto MAP
Corrige y sincroniza el análisis exploratorio con los datos reales, incorpora a Abby Sofia Donis Agreda en la documentación, actualiza el README y las rutas de recursos, agrega la revisión bibliográfica en formato APA, genera las presentaciones HTML y PowerPoint, recompila los informes PDF y añade scripts y dependencias para reproducir y validar el proyecto.
</commit_message>
<xml_diff>
--- a/file/Presentacion_Repositorio_MAP.docx
+++ b/file/Presentacion_Repositorio_MAP.docx
@@ -159,7 +159,7 @@
                 <w:color w:val="C8D9E8"/>
                 <w:sz w:val="19"/>
               </w:rPr>
-              <w:t>Daniel Barillas  ·  Mario Gómez  ·  Marco Romero</w:t>
+              <w:t>Jorge Gabriel Palacios Sales  ·  Pablo Daniel Barillas Moreno  ·  Roberto Emiliano Otoniel Camposeco Torres  ·  Abby Sofia Donis Agreda</w:t>
             </w:r>
             <w:r>
               <w:rPr>
@@ -191,8 +191,7 @@
         <w:pStyle w:val="Kicker"/>
       </w:pPr>
       <w:r>
-        <w:lastRenderedPageBreak/>
-        <w:t>RESUMEN EJECUTIVO</w:t>
+        <w:t>RESUMEN</w:t>
       </w:r>
     </w:p>
     <w:p>
@@ -210,16 +209,7 @@
         <w:jc w:val="both"/>
       </w:pPr>
       <w:r>
-        <w:t xml:space="preserve">Este documento presenta </w:t>
-      </w:r>
-      <w:r>
-        <w:rPr>
-          <w:b/>
-        </w:rPr>
-        <w:t>cómo está organizado el repositorio, qué artefactos contiene y qué hace falta para que otra persona pueda reproducir el análisis</w:t>
-      </w:r>
-      <w:r>
-        <w:t>. No reejecuta el notebook ni recalcula resultados; describe la evidencia ya persistida en él.</w:t>
+        <w:t>Este documento presenta cómo está organizado el repositorio, qué artefactos contiene y cómo reproducir el análisis. El notebook fue ejecutado desde cero con los CSV locales; sus 26 celdas de código finalizaron sin errores y las siete figuras de los entregables se regeneraron desde esas salidas.</w:t>
       </w:r>
     </w:p>
     <w:tbl>
@@ -339,30 +329,9 @@
             </w:tcMar>
           </w:tcPr>
           <w:p>
-            <w:pPr>
-              <w:spacing w:after="60"/>
-              <w:jc w:val="center"/>
-            </w:pPr>
             <w:r>
-              <w:rPr>
-                <w:rFonts w:ascii="Aptos Display" w:hAnsi="Aptos Display"/>
-                <w:b/>
-                <w:color w:val="2F9B77"/>
-                <w:sz w:val="48"/>
-              </w:rPr>
-              <w:t>65</w:t>
-            </w:r>
-          </w:p>
-          <w:p>
-            <w:pPr>
-              <w:spacing w:after="0"/>
-              <w:jc w:val="center"/>
-            </w:pPr>
-            <w:r>
-              <w:rPr>
-                <w:color w:val="607487"/>
-                <w:sz w:val="17"/>
-              </w:rPr>
+              <w:t>35</w:t>
+              <w:br/>
               <w:t>concepciones erróneas</w:t>
             </w:r>
           </w:p>
@@ -382,31 +351,10 @@
             </w:tcMar>
           </w:tcPr>
           <w:p>
-            <w:pPr>
-              <w:spacing w:after="60"/>
-              <w:jc w:val="center"/>
-            </w:pPr>
             <w:r>
-              <w:rPr>
-                <w:rFonts w:ascii="Aptos Display" w:hAnsi="Aptos Display"/>
-                <w:b/>
-                <w:color w:val="28A9C7"/>
-                <w:sz w:val="48"/>
-              </w:rPr>
               <w:t>18</w:t>
-            </w:r>
-          </w:p>
-          <w:p>
-            <w:pPr>
-              <w:spacing w:after="0"/>
-              <w:jc w:val="center"/>
-            </w:pPr>
-            <w:r>
-              <w:rPr>
-                <w:color w:val="607487"/>
-                <w:sz w:val="17"/>
-              </w:rPr>
-              <w:t>diapositivas HTML</w:t>
+              <w:br/>
+              <w:t>diapositivas PPTX/HTML</w:t>
             </w:r>
           </w:p>
         </w:tc>
@@ -608,195 +556,62 @@
               <w:bottom w:w="240" w:type="dxa"/>
               <w:right w:w="260" w:type="dxa"/>
             </w:tcMar>
+            <w:vAlign w:val="center"/>
           </w:tcPr>
           <w:p>
             <w:pPr>
-              <w:pStyle w:val="RepoTree"/>
-              <w:rPr>
-                <w:rFonts w:hint="eastAsia"/>
-              </w:rPr>
+              <w:spacing w:after="0" w:line="221" w:lineRule="auto"/>
             </w:pPr>
             <w:r>
               <w:rPr>
-                <w:b/>
-                <w:color w:val="F2B84B"/>
+                <w:rFonts w:ascii="Consolas" w:hAnsi="Consolas"/>
+                <w:color w:val="FFFFFF"/>
+                <w:sz w:val="15"/>
               </w:rPr>
               <w:t>Proyecto-2_Grupo-1_DS_Sec-10/</w:t>
-            </w:r>
-          </w:p>
-          <w:p>
-            <w:pPr>
-              <w:pStyle w:val="RepoTree"/>
-              <w:rPr>
-                <w:rFonts w:hint="eastAsia"/>
-              </w:rPr>
-            </w:pPr>
-            <w:r>
+              <w:br/>
               <w:t>├── data/</w:t>
-            </w:r>
-          </w:p>
-          <w:p>
-            <w:pPr>
-              <w:pStyle w:val="RepoTree"/>
-              <w:rPr>
-                <w:rFonts w:hint="eastAsia"/>
-              </w:rPr>
-            </w:pPr>
-            <w:r>
+              <w:br/>
               <w:t>│   ├── train.csv</w:t>
-            </w:r>
-          </w:p>
-          <w:p>
-            <w:pPr>
-              <w:pStyle w:val="RepoTree"/>
-              <w:rPr>
-                <w:rFonts w:hint="eastAsia"/>
-              </w:rPr>
-            </w:pPr>
-            <w:r>
+              <w:br/>
               <w:t>│   ├── test.csv</w:t>
-            </w:r>
-          </w:p>
-          <w:p>
-            <w:pPr>
-              <w:pStyle w:val="RepoTree"/>
-              <w:rPr>
-                <w:rFonts w:hint="eastAsia"/>
-              </w:rPr>
-            </w:pPr>
-            <w:r>
+              <w:br/>
               <w:t>│   └── sample_submission.csv</w:t>
-            </w:r>
-          </w:p>
-          <w:p>
-            <w:pPr>
-              <w:pStyle w:val="RepoTree"/>
-              <w:rPr>
-                <w:rFonts w:hint="eastAsia"/>
-              </w:rPr>
-            </w:pPr>
-            <w:r>
+              <w:br/>
               <w:t>├── instructions/</w:t>
-            </w:r>
-          </w:p>
-          <w:p>
-            <w:pPr>
-              <w:pStyle w:val="RepoTree"/>
-              <w:rPr>
-                <w:rFonts w:hint="eastAsia"/>
-              </w:rPr>
-            </w:pPr>
-            <w:r>
-              <w:t>│   └── Proyecto 2. Análisis Exploratorio. 2026 (4).pdf</w:t>
-            </w:r>
-          </w:p>
-          <w:p>
-            <w:pPr>
-              <w:pStyle w:val="RepoTree"/>
-              <w:rPr>
-                <w:rFonts w:hint="eastAsia"/>
-              </w:rPr>
-            </w:pPr>
-            <w:r>
+              <w:br/>
+              <w:t>│   └── Proyecto 2. Análisis Exploratorio. 2026.pdf</w:t>
+              <w:br/>
               <w:t>├── notebooks/</w:t>
-            </w:r>
-          </w:p>
-          <w:p>
-            <w:pPr>
-              <w:pStyle w:val="RepoTree"/>
-              <w:rPr>
-                <w:rFonts w:hint="eastAsia"/>
-              </w:rPr>
-            </w:pPr>
-            <w:r>
-              <w:t>│   └── MAP_Student_Math_Misunderstandings.ipynb</w:t>
-            </w:r>
-          </w:p>
-          <w:p>
-            <w:pPr>
-              <w:pStyle w:val="RepoTree"/>
-              <w:rPr>
-                <w:rFonts w:hint="eastAsia"/>
-              </w:rPr>
-            </w:pPr>
-            <w:r>
+              <w:br/>
+              <w:t>│   ├── 01_analisis_exploratorio.ipynb</w:t>
+              <w:br/>
+              <w:t>│   └── exportar_figuras.py</w:t>
+              <w:br/>
               <w:t>├── report/</w:t>
-            </w:r>
-          </w:p>
-          <w:p>
-            <w:pPr>
-              <w:pStyle w:val="RepoTree"/>
-              <w:rPr>
-                <w:rFonts w:hint="eastAsia"/>
-              </w:rPr>
-            </w:pPr>
-            <w:r>
+              <w:br/>
               <w:t>│   ├── assets/</w:t>
-            </w:r>
-          </w:p>
-          <w:p>
-            <w:pPr>
-              <w:pStyle w:val="RepoTree"/>
-              <w:rPr>
-                <w:rFonts w:hint="eastAsia"/>
-              </w:rPr>
-            </w:pPr>
-            <w:r>
+              <w:br/>
               <w:t>│   ├── informe_analisis_exploratorio_MAP.tex / .pdf</w:t>
-            </w:r>
-          </w:p>
-          <w:p>
-            <w:pPr>
-              <w:pStyle w:val="RepoTree"/>
-              <w:rPr>
-                <w:rFonts w:hint="eastAsia"/>
-              </w:rPr>
-            </w:pPr>
-            <w:r>
+              <w:br/>
+              <w:t>│   └── revision_bibliografica_algoritmos_MAP.tex / .pdf</w:t>
+              <w:br/>
+              <w:t>├── presentation/</w:t>
+              <w:br/>
               <w:t>│   ├── presentacion_MAP.html</w:t>
-            </w:r>
-          </w:p>
-          <w:p>
-            <w:pPr>
-              <w:pStyle w:val="RepoTree"/>
-              <w:rPr>
-                <w:rFonts w:hint="eastAsia"/>
-              </w:rPr>
-            </w:pPr>
-            <w:r>
-              <w:t>│   └── Presentacion_Repositorio_MAP.docx</w:t>
-            </w:r>
-          </w:p>
-          <w:p>
-            <w:pPr>
-              <w:pStyle w:val="RepoTree"/>
-              <w:rPr>
-                <w:rFonts w:hint="eastAsia"/>
-              </w:rPr>
-            </w:pPr>
-            <w:r>
-              <w:t>├── .gitignore</w:t>
-            </w:r>
-          </w:p>
-          <w:p>
-            <w:pPr>
-              <w:pStyle w:val="RepoTree"/>
-              <w:rPr>
-                <w:rFonts w:hint="eastAsia"/>
-              </w:rPr>
-            </w:pPr>
-            <w:r>
+              <w:br/>
+              <w:t>│   ├── presentacion_MAP.pptx / .pdf</w:t>
+              <w:br/>
+              <w:t>│   └── generar_presentacion.py</w:t>
+              <w:br/>
+              <w:t>├── file/</w:t>
+              <w:br/>
+              <w:t>│   └── Presentacion_Repositorio_MAP.docx / .pdf</w:t>
+              <w:br/>
+              <w:t>├── requirements.txt</w:t>
+              <w:br/>
               <w:t>├── LICENSE</w:t>
-            </w:r>
-          </w:p>
-          <w:p>
-            <w:pPr>
-              <w:pStyle w:val="RepoTree"/>
-              <w:rPr>
-                <w:rFonts w:hint="eastAsia"/>
-              </w:rPr>
-            </w:pPr>
-            <w:r>
+              <w:br/>
               <w:t>└── README.md</w:t>
             </w:r>
           </w:p>
@@ -1242,15 +1057,8 @@
             <w:vAlign w:val="center"/>
           </w:tcPr>
           <w:p>
-            <w:pPr>
-              <w:spacing w:after="0"/>
-              <w:jc w:val="center"/>
-            </w:pPr>
             <w:r>
-              <w:rPr>
-                <w:sz w:val="17"/>
-              </w:rPr>
-              <w:t>Creado localmente; requiere commit/push</w:t>
+              <w:t>Informes, activos y presentaciones verificados localmente</w:t>
             </w:r>
           </w:p>
         </w:tc>
@@ -1331,15 +1139,8 @@
             <w:vAlign w:val="center"/>
           </w:tcPr>
           <w:p>
-            <w:pPr>
-              <w:spacing w:after="0"/>
-              <w:jc w:val="center"/>
-            </w:pPr>
             <w:r>
-              <w:rPr>
-                <w:sz w:val="17"/>
-              </w:rPr>
-              <w:t>Incompleto: solo contiene un recordatorio</w:t>
+              <w:t>Completo: contexto, resultados, reproducción y entregables</w:t>
             </w:r>
           </w:p>
         </w:tc>
@@ -1771,14 +1572,8 @@
             <w:vAlign w:val="center"/>
           </w:tcPr>
           <w:p>
-            <w:pPr>
-              <w:spacing w:after="0"/>
-            </w:pPr>
             <w:r>
-              <w:rPr>
-                <w:sz w:val="19"/>
-              </w:rPr>
-              <w:t>PDF, HTML interactivo y este DOCX</w:t>
+              <w:t>PDF, HTML interactivo, PowerPoint editable y DOCX</w:t>
             </w:r>
           </w:p>
         </w:tc>
@@ -1829,27 +1624,10 @@
             </w:tcMar>
           </w:tcPr>
           <w:p>
-            <w:pPr>
-              <w:spacing w:after="60"/>
-            </w:pPr>
             <w:r>
-              <w:rPr>
-                <w:rFonts w:ascii="Aptos Display" w:hAnsi="Aptos Display"/>
-                <w:b/>
-                <w:color w:val="102A43"/>
-                <w:sz w:val="22"/>
-              </w:rPr>
               <w:t>Regla de trazabilidad</w:t>
-            </w:r>
-          </w:p>
-          <w:p>
-            <w:pPr>
-              <w:pStyle w:val="Textoindependiente"/>
-              <w:spacing w:after="0"/>
-              <w:jc w:val="both"/>
-            </w:pPr>
-            <w:r>
-              <w:t>Las cifras y figuras del informe provienen de salidas ya guardadas en el notebook. La preparación documental no ejecutó celdas ni modificó los datos.</w:t>
+              <w:br/>
+              <w:t>Las cifras se contrastaron con train.csv. El notebook se ejecutó en orden y las siete figuras se exportaron de sus salidas antes de regenerar los informes y la presentación.</w:t>
             </w:r>
           </w:p>
         </w:tc>
@@ -1983,15 +1761,8 @@
             <w:vAlign w:val="center"/>
           </w:tcPr>
           <w:p>
-            <w:pPr>
-              <w:spacing w:after="0"/>
-              <w:jc w:val="center"/>
-            </w:pPr>
             <w:r>
-              <w:rPr>
-                <w:sz w:val="17"/>
-              </w:rPr>
-              <w:t>MAP_Student_Math_Misunderstandings.ipynb</w:t>
+              <w:t>01_analisis_exploratorio.ipynb</w:t>
             </w:r>
           </w:p>
         </w:tc>
@@ -2072,15 +1843,8 @@
             <w:vAlign w:val="center"/>
           </w:tcPr>
           <w:p>
-            <w:pPr>
-              <w:spacing w:after="0"/>
-              <w:jc w:val="center"/>
-            </w:pPr>
             <w:r>
-              <w:rPr>
-                <w:sz w:val="17"/>
-              </w:rPr>
-              <w:t>informe_analisis_exploratorio_MAP.pdf</w:t>
+              <w:t>informes EDA y revisión bibliográfica (.pdf/.tex)</w:t>
             </w:r>
           </w:p>
         </w:tc>
@@ -2128,15 +1892,8 @@
             <w:vAlign w:val="center"/>
           </w:tcPr>
           <w:p>
-            <w:pPr>
-              <w:spacing w:after="0"/>
-              <w:jc w:val="center"/>
-            </w:pPr>
             <w:r>
-              <w:rPr>
-                <w:sz w:val="17"/>
-              </w:rPr>
-              <w:t>Desarrollo científico completo según rúbrica</w:t>
+              <w:t>Rúbrica EDA, investigación APA y selección preliminar</w:t>
             </w:r>
           </w:p>
         </w:tc>
@@ -2161,15 +1918,8 @@
             <w:vAlign w:val="center"/>
           </w:tcPr>
           <w:p>
-            <w:pPr>
-              <w:spacing w:after="0"/>
-              <w:jc w:val="center"/>
-            </w:pPr>
             <w:r>
-              <w:rPr>
-                <w:sz w:val="17"/>
-              </w:rPr>
-              <w:t>presentacion_MAP.html</w:t>
+              <w:t>presentacion_MAP.html / .pptx</w:t>
             </w:r>
           </w:p>
         </w:tc>
@@ -2217,15 +1967,8 @@
             <w:vAlign w:val="center"/>
           </w:tcPr>
           <w:p>
-            <w:pPr>
-              <w:spacing w:after="0"/>
-              <w:jc w:val="center"/>
-            </w:pPr>
             <w:r>
-              <w:rPr>
-                <w:sz w:val="17"/>
-              </w:rPr>
-              <w:t>Recorrido visual interactivo de 18 diapositivas</w:t>
+              <w:t>Recorrido visual interactivo y PowerPoint editable</w:t>
             </w:r>
           </w:p>
         </w:tc>
@@ -2458,30 +2201,9 @@
             </w:tcMar>
           </w:tcPr>
           <w:p>
-            <w:pPr>
-              <w:spacing w:after="60"/>
-              <w:jc w:val="center"/>
-            </w:pPr>
             <w:r>
-              <w:rPr>
-                <w:rFonts w:ascii="Aptos Display" w:hAnsi="Aptos Display"/>
-                <w:b/>
-                <w:color w:val="2F9B77"/>
-                <w:sz w:val="48"/>
-              </w:rPr>
-              <w:t>≈15</w:t>
-            </w:r>
-          </w:p>
-          <w:p>
-            <w:pPr>
-              <w:spacing w:after="0"/>
-              <w:jc w:val="center"/>
-            </w:pPr>
-            <w:r>
-              <w:rPr>
-                <w:color w:val="607487"/>
-                <w:sz w:val="17"/>
-              </w:rPr>
+              <w:t>13</w:t>
+              <w:br/>
               <w:t>palabras de mediana</w:t>
             </w:r>
           </w:p>
@@ -3219,15 +2941,8 @@
             <w:vAlign w:val="center"/>
           </w:tcPr>
           <w:p>
-            <w:pPr>
-              <w:spacing w:after="0"/>
-              <w:jc w:val="center"/>
-            </w:pPr>
             <w:r>
-              <w:rPr>
-                <w:sz w:val="17"/>
-              </w:rPr>
-              <w:t>Crear un entorno y documentar dependencias</w:t>
+              <w:t>Crear un entorno e instalar requirements.txt</w:t>
             </w:r>
           </w:p>
         </w:tc>
@@ -3247,15 +2962,8 @@
             <w:vAlign w:val="center"/>
           </w:tcPr>
           <w:p>
-            <w:pPr>
-              <w:spacing w:after="0"/>
-              <w:jc w:val="center"/>
-            </w:pPr>
             <w:r>
-              <w:rPr>
-                <w:sz w:val="17"/>
-              </w:rPr>
-              <w:t>requirements.txt o environment.yml</w:t>
+              <w:t>Versiones fijadas para análisis y generación documental</w:t>
             </w:r>
           </w:p>
         </w:tc>
@@ -3442,7 +3150,7 @@
         <w:pStyle w:val="Ttulo2"/>
       </w:pPr>
       <w:r>
-        <w:t>Bloqueos observados</w:t>
+        <w:t>Estado de reproducibilidad</w:t>
       </w:r>
     </w:p>
     <w:tbl>
@@ -3471,25 +3179,10 @@
             </w:tcMar>
           </w:tcPr>
           <w:p>
-            <w:pPr>
-              <w:jc w:val="both"/>
-            </w:pPr>
             <w:r>
-              <w:rPr>
-                <w:b/>
-                <w:color w:val="D94B4B"/>
-                <w:sz w:val="22"/>
-              </w:rPr>
               <w:t>Ruta de datos</w:t>
-            </w:r>
-          </w:p>
-          <w:p>
-            <w:pPr>
-              <w:pStyle w:val="Textoindependiente"/>
-              <w:jc w:val="both"/>
-            </w:pPr>
-            <w:r>
-              <w:t>El notebook apunta a data/raw, pero los CSV observados están directamente en data/.</w:t>
+              <w:br/>
+              <w:t>El notebook localiza data/ y data/raw desde la raíz o desde notebooks/.</w:t>
             </w:r>
           </w:p>
         </w:tc>
@@ -3505,25 +3198,10 @@
             </w:tcMar>
           </w:tcPr>
           <w:p>
-            <w:pPr>
-              <w:jc w:val="both"/>
-            </w:pPr>
             <w:r>
-              <w:rPr>
-                <w:b/>
-                <w:color w:val="F2B84B"/>
-                <w:sz w:val="22"/>
-              </w:rPr>
               <w:t>Dependencias</w:t>
-            </w:r>
-          </w:p>
-          <w:p>
-            <w:pPr>
-              <w:pStyle w:val="Textoindependiente"/>
-              <w:jc w:val="both"/>
-            </w:pPr>
-            <w:r>
-              <w:t>No existe todavía un manifiesto reproducible del entorno Python.</w:t>
+              <w:br/>
+              <w:t>requirements.txt fija el entorno de análisis y los generadores documentales.</w:t>
             </w:r>
           </w:p>
         </w:tc>
@@ -3574,27 +3252,10 @@
             </w:tcMar>
           </w:tcPr>
           <w:p>
-            <w:pPr>
-              <w:spacing w:after="60"/>
-            </w:pPr>
             <w:r>
-              <w:rPr>
-                <w:rFonts w:ascii="Aptos Display" w:hAnsi="Aptos Display"/>
-                <w:b/>
-                <w:color w:val="102A43"/>
-                <w:sz w:val="22"/>
-              </w:rPr>
-              <w:t>Corrección recomendada</w:t>
-            </w:r>
-          </w:p>
-          <w:p>
-            <w:pPr>
-              <w:pStyle w:val="Textoindependiente"/>
-              <w:spacing w:after="0"/>
-              <w:jc w:val="both"/>
-            </w:pPr>
-            <w:r>
-              <w:t>Definir una única constante de ruta relativa a la raíz del repositorio, documentarla en README y añadir un archivo de dependencias antes de la entrega.</w:t>
+              <w:t>Estado corregido</w:t>
+              <w:br/>
+              <w:t>Ruta flexible, dependencias fijadas, notebook ejecutado sin errores, figuras sincronizadas y entregables compilados. Solo resta hacer commit y push cuando el equipo apruebe la versión final.</w:t>
             </w:r>
           </w:p>
         </w:tc>
@@ -3669,10 +3330,7 @@
         <w:ind w:left="397" w:hanging="397"/>
       </w:pPr>
       <w:r>
-        <w:rPr>
-          <w:sz w:val="17"/>
-        </w:rPr>
-        <w:t>Repositorio local y salidas persistidas de MAP_Student_Math_Misunderstandings.ipynb.</w:t>
+        <w:t>Repositorio local y salidas verificadas de notebooks/01_analisis_exploratorio.ipynb.</w:t>
       </w:r>
     </w:p>
     <w:sectPr>

</xml_diff>